<commit_message>
style(lumieres): revue des lumières — la couleur de l'écran jusque dans les lampes
- Scènes recalées sur la couleur du rôle à l'écran : Petite Fille violet
  rosé (était pêche), mission bleue (rose-rouge), bonus de mission vert
  (orange), Chasseur braise (presque la lumière du jour), Corbeau blanc
  froid (bleu-violet), Salvateur bleu ciel (vert d'eau), Cupidon rose
  (lilas), transmission d'écharpe et cloche alignées.
- Victoire à la couleur du camp gagnant (flash.victoire.*) au lieu d'un
  jaune-vert pour tous ; mission réussie en vert (flash.reussite).
- Scène missionVote ajoutée (la lumière restait sur la mission).
- Fiche gestion/3 - Lumieres Philips Hue tenue à jour (couleurs).
- Vérifié : chaque scène citée existe et sert, une par phase et par
  évènement ; scénarios 51/51, rythme 25/25, annonces 13/13.

Co-Authored-By: Claude Opus 5.5 <noreply@anthropic.com>
</commit_message>
<xml_diff>
--- a/gestion/3 - Lumieres Philips Hue.docx
+++ b/gestion/3 - Lumieres Philips Hue.docx
@@ -493,7 +493,7 @@
                 <w:sz w:val="22"/>
                 <w:szCs w:val="22"/>
               </w:rPr>
-              <w:t>Bleu turquoise</w:t>
+              <w:t>Bleu ciel</w:t>
             </w:r>
           </w:p>
         </w:tc>
@@ -707,7 +707,7 @@
                 <w:sz w:val="22"/>
                 <w:szCs w:val="22"/>
               </w:rPr>
-              <w:t>Rose pêche</w:t>
+              <w:t>Violet rosé</w:t>
             </w:r>
           </w:p>
         </w:tc>
@@ -1021,7 +1021,7 @@
         <w:t>l’Idiot démasqué, l’Ange révélé, la cloche</w:t>
       </w:r>
       <w:r>
-        <w:t xml:space="preserve"> du maire, la victoire.</w:t>
+        <w:t xml:space="preserve"> du maire, la victoire (aux couleurs du camp gagnant).</w:t>
       </w:r>
     </w:p>
     <w:p>

</xml_diff>